<commit_message>
Fix: Cabios al contexto
</commit_message>
<xml_diff>
--- a/context.docx
+++ b/context.docx
@@ -21,15 +21,7 @@
         <w:t>{</w:t>
       </w:r>
       <w:r>
-        <w:t>"id":</w:t>
-      </w:r>
-      <w:proofErr w:type="spellStart"/>
-      <w:r>
-        <w:t>int</w:t>
-      </w:r>
-      <w:proofErr w:type="spellEnd"/>
-      <w:r>
-        <w:t>, planta":</w:t>
+        <w:t>"id":int, planta":</w:t>
       </w:r>
       <w:r>
         <w:t xml:space="preserve"> </w:t>
@@ -42,57 +34,25 @@
         <w:t>{</w:t>
       </w:r>
       <w:r>
-        <w:t>"id":</w:t>
-      </w:r>
-      <w:proofErr w:type="spellStart"/>
-      <w:r>
-        <w:t>int</w:t>
-      </w:r>
-      <w:proofErr w:type="spellEnd"/>
-      <w:r>
-        <w:t>,</w:t>
+        <w:t>"id":int,</w:t>
       </w:r>
       <w:r>
         <w:t xml:space="preserve"> </w:t>
       </w:r>
       <w:r>
-        <w:t>"nombre":"</w:t>
-      </w:r>
-      <w:proofErr w:type="spellStart"/>
-      <w:r>
-        <w:t>string</w:t>
-      </w:r>
-      <w:proofErr w:type="spellEnd"/>
-      <w:r>
-        <w:t>",</w:t>
+        <w:t>"nombre":"string",</w:t>
       </w:r>
       <w:r>
         <w:t xml:space="preserve"> </w:t>
       </w:r>
       <w:r>
-        <w:t>"tipo":"</w:t>
-      </w:r>
-      <w:proofErr w:type="spellStart"/>
-      <w:r>
-        <w:t>string</w:t>
-      </w:r>
-      <w:proofErr w:type="spellEnd"/>
-      <w:r>
-        <w:t>",</w:t>
+        <w:t>"tipo":"string",</w:t>
       </w:r>
       <w:r>
         <w:t xml:space="preserve"> </w:t>
       </w:r>
       <w:r>
-        <w:t>"tipo_suelo":"</w:t>
-      </w:r>
-      <w:proofErr w:type="spellStart"/>
-      <w:r>
-        <w:t>string</w:t>
-      </w:r>
-      <w:proofErr w:type="spellEnd"/>
-      <w:r>
-        <w:t>"</w:t>
+        <w:t>"tipo_suelo":"string"</w:t>
       </w:r>
       <w:r>
         <w:rPr>
@@ -108,58 +68,41 @@
         <w:t xml:space="preserve"> </w:t>
       </w:r>
       <w:r>
-        <w:t>"</w:t>
-      </w:r>
-      <w:proofErr w:type="spellStart"/>
-      <w:r>
-        <w:t>humedad_suelo</w:t>
-      </w:r>
-      <w:proofErr w:type="spellEnd"/>
+        <w:t>"humedad_suelo":</w:t>
+      </w:r>
+      <w:r>
+        <w:t xml:space="preserve"> </w:t>
+      </w:r>
+      <w:r>
+        <w:t>f</w:t>
+      </w:r>
+      <w:r>
+        <w:t xml:space="preserve">loat, </w:t>
+      </w:r>
+      <w:r>
+        <w:t>"temperatura_ambiente</w:t>
+      </w:r>
+      <w:proofErr w:type="gramStart"/>
       <w:r>
         <w:t>":</w:t>
       </w:r>
       <w:r>
-        <w:t xml:space="preserve"> </w:t>
-      </w:r>
-      <w:proofErr w:type="spellStart"/>
-      <w:r>
-        <w:t>f</w:t>
-      </w:r>
-      <w:r>
-        <w:t>loat</w:t>
-      </w:r>
-      <w:proofErr w:type="spellEnd"/>
+        <w:t>float</w:t>
+      </w:r>
+      <w:proofErr w:type="gramEnd"/>
       <w:r>
         <w:t xml:space="preserve">, </w:t>
       </w:r>
       <w:r>
-        <w:t>"temperatura_ambiente</w:t>
+        <w:t>"luminosidad</w:t>
       </w:r>
       <w:proofErr w:type="gramStart"/>
       <w:r>
         <w:t>":</w:t>
       </w:r>
-      <w:proofErr w:type="spellStart"/>
       <w:r>
         <w:t>float</w:t>
       </w:r>
-      <w:proofErr w:type="spellEnd"/>
-      <w:proofErr w:type="gramEnd"/>
-      <w:r>
-        <w:t xml:space="preserve">, </w:t>
-      </w:r>
-      <w:r>
-        <w:t>"luminosidad</w:t>
-      </w:r>
-      <w:proofErr w:type="gramStart"/>
-      <w:r>
-        <w:t>":</w:t>
-      </w:r>
-      <w:proofErr w:type="spellStart"/>
-      <w:r>
-        <w:t>float</w:t>
-      </w:r>
-      <w:proofErr w:type="spellEnd"/>
       <w:proofErr w:type="gramEnd"/>
       <w:r>
         <w:t xml:space="preserve">, </w:t>
@@ -180,22 +123,15 @@
       </w:r>
       <w:proofErr w:type="gramEnd"/>
       <w:r>
-        <w:t>"</w:t>
-      </w:r>
-      <w:proofErr w:type="spellStart"/>
-      <w:r>
-        <w:t>nitrogeno</w:t>
-      </w:r>
-      <w:proofErr w:type="spellEnd"/>
+        <w:t>"nitrogeno</w:t>
+      </w:r>
       <w:proofErr w:type="gramStart"/>
       <w:r>
         <w:t>":</w:t>
       </w:r>
-      <w:proofErr w:type="spellStart"/>
       <w:r>
         <w:t>float</w:t>
       </w:r>
-      <w:proofErr w:type="spellEnd"/>
       <w:proofErr w:type="gramEnd"/>
       <w:r>
         <w:t>,</w:t>
@@ -207,11 +143,9 @@
       <w:r>
         <w:t>":</w:t>
       </w:r>
-      <w:proofErr w:type="spellStart"/>
       <w:r>
         <w:t>float</w:t>
       </w:r>
-      <w:proofErr w:type="spellEnd"/>
       <w:proofErr w:type="gramEnd"/>
       <w:r>
         <w:t xml:space="preserve">, </w:t>
@@ -223,11 +157,9 @@
       <w:r>
         <w:t>":</w:t>
       </w:r>
-      <w:proofErr w:type="spellStart"/>
       <w:r>
         <w:t>float</w:t>
       </w:r>
-      <w:proofErr w:type="spellEnd"/>
       <w:proofErr w:type="gramEnd"/>
       <w:r>
         <w:rPr>
@@ -246,11 +178,9 @@
       <w:r>
         <w:t>"fecha":"</w:t>
       </w:r>
-      <w:proofErr w:type="spellStart"/>
       <w:r>
         <w:t>timestamp</w:t>
       </w:r>
-      <w:proofErr w:type="spellEnd"/>
       <w:r>
         <w:t>"</w:t>
       </w:r>
@@ -266,22 +196,18 @@
       <w:r>
         <w:t>Toma en cuenta que “</w:t>
       </w:r>
-      <w:proofErr w:type="spellStart"/>
       <w:r>
         <w:t>humedad_suelo</w:t>
       </w:r>
-      <w:proofErr w:type="spellEnd"/>
       <w:r>
         <w:t xml:space="preserve">” es en %, la </w:t>
       </w:r>
       <w:r>
         <w:t>"</w:t>
       </w:r>
-      <w:proofErr w:type="spellStart"/>
       <w:r>
         <w:t>temperatura_ambiente</w:t>
       </w:r>
-      <w:proofErr w:type="spellEnd"/>
       <w:r>
         <w:t>"</w:t>
       </w:r>
@@ -296,232 +222,16 @@
     </w:p>
     <w:p>
       <w:r>
-        <w:t>{ "</w:t>
-      </w:r>
-      <w:proofErr w:type="spellStart"/>
-      <w:r>
-        <w:t>type</w:t>
-      </w:r>
-      <w:proofErr w:type="spellEnd"/>
-      <w:r>
-        <w:t>": "</w:t>
-      </w:r>
-      <w:proofErr w:type="spellStart"/>
-      <w:r>
-        <w:t>object</w:t>
-      </w:r>
-      <w:proofErr w:type="spellEnd"/>
-      <w:r>
-        <w:t>", "</w:t>
-      </w:r>
-      <w:proofErr w:type="spellStart"/>
-      <w:r>
-        <w:t>properties</w:t>
-      </w:r>
-      <w:proofErr w:type="spellEnd"/>
-      <w:r>
-        <w:t>": { "</w:t>
-      </w:r>
-      <w:proofErr w:type="spellStart"/>
-      <w:r>
-        <w:t>estado_general</w:t>
-      </w:r>
-      <w:proofErr w:type="spellEnd"/>
-      <w:r>
-        <w:t>": { "</w:t>
-      </w:r>
-      <w:proofErr w:type="spellStart"/>
-      <w:r>
-        <w:t>type</w:t>
-      </w:r>
-      <w:proofErr w:type="spellEnd"/>
-      <w:r>
-        <w:t>": "</w:t>
-      </w:r>
-      <w:proofErr w:type="spellStart"/>
-      <w:r>
-        <w:t>string</w:t>
-      </w:r>
-      <w:proofErr w:type="spellEnd"/>
-      <w:r>
-        <w:t>", "</w:t>
-      </w:r>
-      <w:proofErr w:type="spellStart"/>
-      <w:r>
-        <w:t>enum</w:t>
-      </w:r>
-      <w:proofErr w:type="spellEnd"/>
-      <w:r>
-        <w:t>": ["Óptimo", "Alerta Moderada", "Crítico"], "</w:t>
-      </w:r>
-      <w:proofErr w:type="spellStart"/>
-      <w:r>
-        <w:t>description</w:t>
-      </w:r>
-      <w:proofErr w:type="spellEnd"/>
-      <w:r>
-        <w:t>": "El diagnóstico general de la planta basado en los datos." }, "</w:t>
-      </w:r>
-      <w:proofErr w:type="spellStart"/>
-      <w:r>
-        <w:t>diagnostico_detallado</w:t>
-      </w:r>
-      <w:proofErr w:type="spellEnd"/>
-      <w:r>
-        <w:t>": { "</w:t>
-      </w:r>
-      <w:proofErr w:type="spellStart"/>
-      <w:r>
-        <w:t>type</w:t>
-      </w:r>
-      <w:proofErr w:type="spellEnd"/>
-      <w:r>
-        <w:t>": "</w:t>
-      </w:r>
-      <w:proofErr w:type="spellStart"/>
-      <w:r>
-        <w:t>string</w:t>
-      </w:r>
-      <w:proofErr w:type="spellEnd"/>
-      <w:r>
-        <w:t>", "</w:t>
-      </w:r>
-      <w:proofErr w:type="spellStart"/>
-      <w:r>
-        <w:t>description</w:t>
-      </w:r>
-      <w:proofErr w:type="spellEnd"/>
-      <w:r>
-        <w:t>": "Explicación breve en español de qué le pasa a la planta." }, "</w:t>
-      </w:r>
-      <w:proofErr w:type="spellStart"/>
-      <w:r>
-        <w:t>acciones_inmediatas</w:t>
-      </w:r>
-      <w:proofErr w:type="spellEnd"/>
-      <w:r>
-        <w:t>": { "</w:t>
-      </w:r>
-      <w:proofErr w:type="spellStart"/>
-      <w:r>
-        <w:t>type</w:t>
-      </w:r>
-      <w:proofErr w:type="spellEnd"/>
-      <w:r>
-        <w:t>": "array", "</w:t>
-      </w:r>
-      <w:proofErr w:type="spellStart"/>
-      <w:r>
-        <w:t>items</w:t>
-      </w:r>
-      <w:proofErr w:type="spellEnd"/>
-      <w:r>
-        <w:t>": { "</w:t>
-      </w:r>
-      <w:proofErr w:type="spellStart"/>
-      <w:r>
-        <w:t>type</w:t>
-      </w:r>
-      <w:proofErr w:type="spellEnd"/>
-      <w:r>
-        <w:t>": "</w:t>
-      </w:r>
-      <w:proofErr w:type="spellStart"/>
-      <w:r>
-        <w:t>string</w:t>
-      </w:r>
-      <w:proofErr w:type="spellEnd"/>
-      <w:r>
-        <w:t>" }, "</w:t>
-      </w:r>
-      <w:proofErr w:type="spellStart"/>
-      <w:r>
-        <w:t>description</w:t>
-      </w:r>
-      <w:proofErr w:type="spellEnd"/>
-      <w:r>
-        <w:t>": "Lista de tareas urgentes que el agricultor debe realizar." }, "</w:t>
-      </w:r>
-      <w:proofErr w:type="spellStart"/>
-      <w:r>
-        <w:t>sugerencia_fertilizante</w:t>
-      </w:r>
-      <w:proofErr w:type="spellEnd"/>
-      <w:r>
-        <w:t>": { "</w:t>
-      </w:r>
-      <w:proofErr w:type="spellStart"/>
-      <w:r>
-        <w:t>type</w:t>
-      </w:r>
-      <w:proofErr w:type="spellEnd"/>
-      <w:r>
-        <w:t>": "</w:t>
-      </w:r>
-      <w:proofErr w:type="spellStart"/>
-      <w:r>
-        <w:t>string</w:t>
-      </w:r>
-      <w:proofErr w:type="spellEnd"/>
-      <w:r>
-        <w:t>", "</w:t>
-      </w:r>
-      <w:proofErr w:type="spellStart"/>
-      <w:r>
-        <w:t>description</w:t>
-      </w:r>
-      <w:proofErr w:type="spellEnd"/>
-      <w:r>
-        <w:t>": "Recomendación específica de ajuste de N-P-K." } }, "</w:t>
-      </w:r>
-      <w:proofErr w:type="spellStart"/>
-      <w:r>
-        <w:t>required</w:t>
-      </w:r>
-      <w:proofErr w:type="spellEnd"/>
-      <w:r>
-        <w:t>": ["</w:t>
-      </w:r>
-      <w:proofErr w:type="spellStart"/>
-      <w:r>
-        <w:t>estado_general</w:t>
-      </w:r>
-      <w:proofErr w:type="spellEnd"/>
-      <w:r>
-        <w:t>", "</w:t>
-      </w:r>
-      <w:proofErr w:type="spellStart"/>
-      <w:r>
-        <w:t>diagnostico_detallado</w:t>
-      </w:r>
-      <w:proofErr w:type="spellEnd"/>
-      <w:r>
-        <w:t>", "acciones_inmediatas"</w:t>
+        <w:t>{ "type": "object", "properties": { "estado_general": { "type": "string", "enum": ["Óptimo", "Alerta Moderada", "Crítico"], "description": "El diagnóstico general de la planta basado en los datos." }, "diagnostico_detallado": { "type": "string", "description": "Explicación breve en español de qué le pasa a la planta." }, "acciones_inmediatas": { "type": "array", "items": { "type": "string" }, "description": "Lista de tareas urgentes que el agricultor debe realizar." }, "sugerencia_fertilizante": { "type": "string", "description": "Recomendación específica de ajuste de N-P-K." } }, "required": ["estado_general", "diagnostico_detallado", "acciones_inmediatas"</w:t>
       </w:r>
       <w:r>
         <w:t>,</w:t>
       </w:r>
       <w:r>
-        <w:t>"</w:t>
-      </w:r>
-      <w:proofErr w:type="spellStart"/>
-      <w:r>
-        <w:t>sugerencia_fertilizante</w:t>
-      </w:r>
-      <w:proofErr w:type="spellEnd"/>
-      <w:r>
-        <w:t>"</w:t>
-      </w:r>
-      <w:r>
-        <w:t>], "</w:t>
-      </w:r>
-      <w:proofErr w:type="spellStart"/>
-      <w:r>
-        <w:t>additionalProperties</w:t>
-      </w:r>
-      <w:proofErr w:type="spellEnd"/>
-      <w:r>
-        <w:t xml:space="preserve">": </w:t>
+        <w:t>"sugerencia_fertilizante"</w:t>
+      </w:r>
+      <w:r>
+        <w:t xml:space="preserve">], "additionalProperties": </w:t>
       </w:r>
       <w:r>
         <w:t>False</w:t>
@@ -574,489 +284,6 @@
     <w:p>
       <w:r>
         <w:t>En caso de que no conozcas la respuesta, dilo.</w:t>
-      </w:r>
-    </w:p>
-    <w:p/>
-    <w:p>
-      <w:r>
-        <w:br w:type="page"/>
-      </w:r>
-    </w:p>
-    <w:p>
-      <w:r>
-        <w:lastRenderedPageBreak/>
-        <w:t>Eres un experto en jardinería e ingeniero agrónomo.</w:t>
-      </w:r>
-    </w:p>
-    <w:p>
-      <w:r>
-        <w:t>Cuando te manden mensajes con el siguiente formato:</w:t>
-      </w:r>
-    </w:p>
-    <w:p>
-      <w:r>
-        <w:rPr>
-          <w:b/>
-          <w:bCs/>
-        </w:rPr>
-        <w:t>{</w:t>
-      </w:r>
-      <w:r>
-        <w:t>"id":</w:t>
-      </w:r>
-      <w:proofErr w:type="spellStart"/>
-      <w:r>
-        <w:t>int</w:t>
-      </w:r>
-      <w:proofErr w:type="spellEnd"/>
-      <w:r>
-        <w:t xml:space="preserve">, </w:t>
-      </w:r>
-      <w:r>
-        <w:t>planta":</w:t>
-      </w:r>
-      <w:r>
-        <w:t xml:space="preserve"> </w:t>
-      </w:r>
-      <w:r>
-        <w:rPr>
-          <w:b/>
-          <w:bCs/>
-        </w:rPr>
-        <w:t>{</w:t>
-      </w:r>
-      <w:r>
-        <w:t>"id":</w:t>
-      </w:r>
-      <w:proofErr w:type="spellStart"/>
-      <w:r>
-        <w:t>int</w:t>
-      </w:r>
-      <w:proofErr w:type="spellEnd"/>
-      <w:r>
-        <w:t>,</w:t>
-      </w:r>
-      <w:r>
-        <w:t xml:space="preserve"> </w:t>
-      </w:r>
-      <w:r>
-        <w:t>"nombre":"</w:t>
-      </w:r>
-      <w:proofErr w:type="spellStart"/>
-      <w:r>
-        <w:t>string</w:t>
-      </w:r>
-      <w:proofErr w:type="spellEnd"/>
-      <w:r>
-        <w:t>"</w:t>
-      </w:r>
-      <w:r>
-        <w:t>,</w:t>
-      </w:r>
-      <w:r>
-        <w:t xml:space="preserve"> </w:t>
-      </w:r>
-      <w:r>
-        <w:t>"tipo":"</w:t>
-      </w:r>
-      <w:proofErr w:type="spellStart"/>
-      <w:r>
-        <w:t>string</w:t>
-      </w:r>
-      <w:proofErr w:type="spellEnd"/>
-      <w:r>
-        <w:t>"</w:t>
-      </w:r>
-      <w:r>
-        <w:t>,</w:t>
-      </w:r>
-      <w:r>
-        <w:t xml:space="preserve"> </w:t>
-      </w:r>
-      <w:r>
-        <w:t>"tipo_suelo":"</w:t>
-      </w:r>
-      <w:proofErr w:type="spellStart"/>
-      <w:r>
-        <w:t>string</w:t>
-      </w:r>
-      <w:proofErr w:type="spellEnd"/>
-      <w:r>
-        <w:t>"</w:t>
-      </w:r>
-      <w:r>
-        <w:rPr>
-          <w:b/>
-          <w:bCs/>
-        </w:rPr>
-        <w:t>}</w:t>
-      </w:r>
-      <w:r>
-        <w:t>,</w:t>
-      </w:r>
-      <w:r>
-        <w:t xml:space="preserve"> </w:t>
-      </w:r>
-      <w:r>
-        <w:t>"humedad_suelo</w:t>
-      </w:r>
-      <w:proofErr w:type="gramStart"/>
-      <w:r>
-        <w:t>":</w:t>
-      </w:r>
-      <w:proofErr w:type="spellStart"/>
-      <w:r>
-        <w:t>f</w:t>
-      </w:r>
-      <w:r>
-        <w:t>loat</w:t>
-      </w:r>
-      <w:proofErr w:type="spellEnd"/>
-      <w:proofErr w:type="gramEnd"/>
-      <w:r>
-        <w:t xml:space="preserve">, </w:t>
-      </w:r>
-      <w:r>
-        <w:t>"temperatura_ambiente</w:t>
-      </w:r>
-      <w:proofErr w:type="gramStart"/>
-      <w:r>
-        <w:t>":</w:t>
-      </w:r>
-      <w:proofErr w:type="spellStart"/>
-      <w:r>
-        <w:t>float</w:t>
-      </w:r>
-      <w:proofErr w:type="spellEnd"/>
-      <w:proofErr w:type="gramEnd"/>
-      <w:r>
-        <w:t xml:space="preserve">, </w:t>
-      </w:r>
-      <w:r>
-        <w:t>"luminosidad</w:t>
-      </w:r>
-      <w:proofErr w:type="gramStart"/>
-      <w:r>
-        <w:t>":</w:t>
-      </w:r>
-      <w:proofErr w:type="spellStart"/>
-      <w:r>
-        <w:t>float</w:t>
-      </w:r>
-      <w:proofErr w:type="spellEnd"/>
-      <w:proofErr w:type="gramEnd"/>
-      <w:r>
-        <w:t xml:space="preserve">, </w:t>
-      </w:r>
-      <w:r>
-        <w:t>"nutrientes</w:t>
-      </w:r>
-      <w:proofErr w:type="gramStart"/>
-      <w:r>
-        <w:t>":</w:t>
-      </w:r>
-      <w:r>
-        <w:rPr>
-          <w:b/>
-          <w:bCs/>
-        </w:rPr>
-        <w:t>{</w:t>
-      </w:r>
-      <w:proofErr w:type="gramEnd"/>
-      <w:r>
-        <w:t>"</w:t>
-      </w:r>
-      <w:proofErr w:type="spellStart"/>
-      <w:r>
-        <w:t>nitrogeno</w:t>
-      </w:r>
-      <w:proofErr w:type="spellEnd"/>
-      <w:proofErr w:type="gramStart"/>
-      <w:r>
-        <w:t>":</w:t>
-      </w:r>
-      <w:proofErr w:type="spellStart"/>
-      <w:r>
-        <w:t>float</w:t>
-      </w:r>
-      <w:proofErr w:type="spellEnd"/>
-      <w:proofErr w:type="gramEnd"/>
-      <w:r>
-        <w:t>,</w:t>
-      </w:r>
-      <w:r>
-        <w:t>"potasio</w:t>
-      </w:r>
-      <w:proofErr w:type="gramStart"/>
-      <w:r>
-        <w:t>":</w:t>
-      </w:r>
-      <w:proofErr w:type="spellStart"/>
-      <w:r>
-        <w:t>float</w:t>
-      </w:r>
-      <w:proofErr w:type="spellEnd"/>
-      <w:proofErr w:type="gramEnd"/>
-      <w:r>
-        <w:t xml:space="preserve">, </w:t>
-      </w:r>
-      <w:r>
-        <w:t>"fosforo</w:t>
-      </w:r>
-      <w:proofErr w:type="gramStart"/>
-      <w:r>
-        <w:t>":</w:t>
-      </w:r>
-      <w:proofErr w:type="spellStart"/>
-      <w:r>
-        <w:t>float</w:t>
-      </w:r>
-      <w:proofErr w:type="spellEnd"/>
-      <w:proofErr w:type="gramEnd"/>
-      <w:r>
-        <w:rPr>
-          <w:b/>
-          <w:bCs/>
-        </w:rPr>
-        <w:t>}</w:t>
-      </w:r>
-      <w:r>
-        <w:rPr>
-          <w:b/>
-          <w:bCs/>
-        </w:rPr>
-        <w:t xml:space="preserve">, </w:t>
-      </w:r>
-      <w:r>
-        <w:t>"fecha":"</w:t>
-      </w:r>
-      <w:proofErr w:type="spellStart"/>
-      <w:r>
-        <w:t>timestamp</w:t>
-      </w:r>
-      <w:proofErr w:type="spellEnd"/>
-      <w:r>
-        <w:t>"</w:t>
-      </w:r>
-      <w:r>
-        <w:rPr>
-          <w:b/>
-          <w:bCs/>
-        </w:rPr>
-        <w:t>}</w:t>
-      </w:r>
-    </w:p>
-    <w:p>
-      <w:r>
-        <w:t>Toma en cuenta que “</w:t>
-      </w:r>
-      <w:proofErr w:type="spellStart"/>
-      <w:r>
-        <w:t>humedad_suelo</w:t>
-      </w:r>
-      <w:proofErr w:type="spellEnd"/>
-      <w:r>
-        <w:t xml:space="preserve">” es en %, la </w:t>
-      </w:r>
-      <w:r>
-        <w:t>"</w:t>
-      </w:r>
-      <w:proofErr w:type="spellStart"/>
-      <w:r>
-        <w:t>temperatura_ambiente</w:t>
-      </w:r>
-      <w:proofErr w:type="spellEnd"/>
-      <w:r>
-        <w:t>"</w:t>
-      </w:r>
-      <w:r>
-        <w:t xml:space="preserve"> es en grados Celsius, “luminosidad” son lux, y los nutrientes son %.</w:t>
-      </w:r>
-    </w:p>
-    <w:p>
-      <w:r>
-        <w:t xml:space="preserve">Responde </w:t>
-      </w:r>
-      <w:r>
-        <w:t>abarcando los siguientes puntos</w:t>
-      </w:r>
-      <w:r>
-        <w:t>:</w:t>
-      </w:r>
-    </w:p>
-    <w:p>
-      <w:r>
-        <w:t xml:space="preserve">* </w:t>
-      </w:r>
-      <w:r>
-        <w:t>"</w:t>
-      </w:r>
-      <w:proofErr w:type="spellStart"/>
-      <w:r>
-        <w:t>estado_general</w:t>
-      </w:r>
-      <w:proofErr w:type="spellEnd"/>
-      <w:proofErr w:type="gramStart"/>
-      <w:r>
-        <w:t>"</w:t>
-      </w:r>
-      <w:r>
-        <w:t xml:space="preserve"> :</w:t>
-      </w:r>
-      <w:proofErr w:type="gramEnd"/>
-      <w:r>
-        <w:t xml:space="preserve"> </w:t>
-      </w:r>
-      <w:r>
-        <w:t>"</w:t>
-      </w:r>
-      <w:proofErr w:type="spellStart"/>
-      <w:r>
-        <w:t>enum</w:t>
-      </w:r>
-      <w:proofErr w:type="spellEnd"/>
-      <w:r>
-        <w:t>": ["Óptimo", "Alerta Moderada", "Crítico"]</w:t>
-      </w:r>
-    </w:p>
-    <w:p>
-      <w:r>
-        <w:t xml:space="preserve">* </w:t>
-      </w:r>
-      <w:r>
-        <w:t>"</w:t>
-      </w:r>
-      <w:proofErr w:type="spellStart"/>
-      <w:r>
-        <w:t>diagnostico_detallado</w:t>
-      </w:r>
-      <w:proofErr w:type="spellEnd"/>
-      <w:r>
-        <w:t>":</w:t>
-      </w:r>
-      <w:r>
-        <w:t xml:space="preserve"> </w:t>
-      </w:r>
-      <w:r>
-        <w:t>"Explicación breve en español de qué le pasa a la planta."</w:t>
-      </w:r>
-    </w:p>
-    <w:p>
-      <w:r>
-        <w:t xml:space="preserve">* </w:t>
-      </w:r>
-      <w:r>
-        <w:t>"</w:t>
-      </w:r>
-      <w:proofErr w:type="spellStart"/>
-      <w:r>
-        <w:t>acciones_inmediatas</w:t>
-      </w:r>
-      <w:proofErr w:type="spellEnd"/>
-      <w:r>
-        <w:t>":</w:t>
-      </w:r>
-      <w:r>
-        <w:t xml:space="preserve"> </w:t>
-      </w:r>
-      <w:r>
-        <w:t>"Lista de tareas urgentes que el agricultor debe realizar."</w:t>
-      </w:r>
-    </w:p>
-    <w:p>
-      <w:r>
-        <w:t xml:space="preserve">* </w:t>
-      </w:r>
-      <w:r>
-        <w:t>"</w:t>
-      </w:r>
-      <w:proofErr w:type="spellStart"/>
-      <w:r>
-        <w:t>sugerencia_fertilizante</w:t>
-      </w:r>
-      <w:proofErr w:type="spellEnd"/>
-      <w:r>
-        <w:t>"</w:t>
-      </w:r>
-      <w:r>
-        <w:t xml:space="preserve">: </w:t>
-      </w:r>
-      <w:r>
-        <w:t>"Recomendación específica de ajuste de N-P-K</w:t>
-      </w:r>
-      <w:r>
-        <w:t>, en caso de no necesitar fertilizante, menciónalo explícitamente</w:t>
-      </w:r>
-      <w:r>
-        <w:t>."</w:t>
-      </w:r>
-    </w:p>
-    <w:p>
-      <w:r>
-        <w:t>Tienes estrictamente prohibido salirte del tema de agricultura.</w:t>
-      </w:r>
-    </w:p>
-    <w:p>
-      <w:r>
-        <w:t>Responde las preguntas con amabilidad y siendo óptimo.</w:t>
-      </w:r>
-    </w:p>
-    <w:p>
-      <w:r>
-        <w:t xml:space="preserve">Basa tus respuestas en tus conocimientos y apóyate en los blogs del siguiente sitio: </w:t>
-      </w:r>
-      <w:hyperlink r:id="rId5" w:history="1">
-        <w:r>
-          <w:rPr>
-            <w:rStyle w:val="Hipervnculo"/>
-          </w:rPr>
-          <w:t>https://jardineriaplantasyflores.com/</w:t>
-        </w:r>
-      </w:hyperlink>
-    </w:p>
-    <w:p>
-      <w:r>
-        <w:t>En caso de que no conozcas la respuesta, dilo.</w:t>
-      </w:r>
-    </w:p>
-    <w:p/>
-    <w:p/>
-    <w:p/>
-    <w:p/>
-    <w:p/>
-    <w:p/>
-    <w:p>
-      <w:proofErr w:type="gramStart"/>
-      <w:r>
-        <w:t>{ "</w:t>
-      </w:r>
-      <w:proofErr w:type="gramEnd"/>
-      <w:r>
-        <w:t>planta": "Tomate", "</w:t>
-      </w:r>
-      <w:proofErr w:type="spellStart"/>
-      <w:r>
-        <w:t>humedad_suelo</w:t>
-      </w:r>
-      <w:proofErr w:type="spellEnd"/>
-      <w:r>
-        <w:t xml:space="preserve">": "25%", "temperatura": "32°C", "luminosidad":"150lx", "nutrientes": </w:t>
-      </w:r>
-      <w:proofErr w:type="gramStart"/>
-      <w:r>
-        <w:t>{ "</w:t>
-      </w:r>
-      <w:proofErr w:type="gramEnd"/>
-      <w:r>
-        <w:t>N": "Bajo", "P": "Medio", "K": "Alto</w:t>
-      </w:r>
-      <w:proofErr w:type="gramStart"/>
-      <w:r>
-        <w:t>" }</w:t>
-      </w:r>
-      <w:proofErr w:type="gramEnd"/>
-      <w:r>
-        <w:t xml:space="preserve"> }</w:t>
       </w:r>
     </w:p>
     <w:p/>
@@ -1673,6 +900,7 @@
   <w:style w:type="character" w:default="1" w:styleId="Fuentedeprrafopredeter">
     <w:name w:val="Default Paragraph Font"/>
     <w:uiPriority w:val="1"/>
+    <w:semiHidden/>
     <w:unhideWhenUsed/>
   </w:style>
   <w:style w:type="table" w:default="1" w:styleId="Tablanormal">

</xml_diff>